<commit_message>
Updated the hibernate notes and other things
</commit_message>
<xml_diff>
--- a/hibernate/Hibernate Question.docx
+++ b/hibernate/Hibernate Question.docx
@@ -4,6 +4,15 @@
   <w:body>
     <w:sdt>
       <w:sdtPr>
+        <w:rPr>
+          <w:rFonts w:asciiTheme="minorHAnsi" w:eastAsiaTheme="minorHAnsi" w:hAnsiTheme="minorHAnsi" w:cstheme="minorBidi"/>
+          <w:color w:val="auto"/>
+          <w:kern w:val="2"/>
+          <w:sz w:val="22"/>
+          <w:szCs w:val="22"/>
+          <w:lang w:val="en-IN"/>
+          <w14:ligatures w14:val="standardContextual"/>
+        </w:rPr>
         <w:id w:val="785309134"/>
         <w:docPartObj>
           <w:docPartGallery w:val="Table of Contents"/>
@@ -12,16 +21,9 @@
       </w:sdtPr>
       <w:sdtEndPr>
         <w:rPr>
-          <w:rFonts w:asciiTheme="minorHAnsi" w:eastAsiaTheme="minorHAnsi" w:hAnsiTheme="minorHAnsi" w:cstheme="minorBidi"/>
           <w:b/>
           <w:bCs/>
           <w:noProof/>
-          <w:color w:val="auto"/>
-          <w:kern w:val="2"/>
-          <w:sz w:val="22"/>
-          <w:szCs w:val="22"/>
-          <w:lang w:val="en-IN"/>
-          <w14:ligatures w14:val="standardContextual"/>
         </w:rPr>
       </w:sdtEndPr>
       <w:sdtContent>
@@ -57,7 +59,7 @@
           <w:r>
             <w:fldChar w:fldCharType="separate"/>
           </w:r>
-          <w:hyperlink w:anchor="_Toc207349462" w:history="1">
+          <w:hyperlink w:anchor="_Toc208146879" w:history="1">
             <w:r>
               <w:rPr>
                 <w:rStyle w:val="Hyperlink"/>
@@ -101,7 +103,7 @@
                 <w:noProof/>
                 <w:webHidden/>
               </w:rPr>
-              <w:instrText xml:space="preserve"> PAGEREF _Toc207349462 \h </w:instrText>
+              <w:instrText xml:space="preserve"> PAGEREF _Toc208146879 \h </w:instrText>
             </w:r>
             <w:r>
               <w:rPr>
@@ -147,7 +149,7 @@
               <w:lang w:eastAsia="en-IN"/>
             </w:rPr>
           </w:pPr>
-          <w:hyperlink w:anchor="_Toc207349463" w:history="1">
+          <w:hyperlink w:anchor="_Toc208146880" w:history="1">
             <w:r>
               <w:rPr>
                 <w:rStyle w:val="Hyperlink"/>
@@ -191,7 +193,7 @@
                 <w:noProof/>
                 <w:webHidden/>
               </w:rPr>
-              <w:instrText xml:space="preserve"> PAGEREF _Toc207349463 \h </w:instrText>
+              <w:instrText xml:space="preserve"> PAGEREF _Toc208146880 \h </w:instrText>
             </w:r>
             <w:r>
               <w:rPr>
@@ -237,7 +239,7 @@
               <w:lang w:eastAsia="en-IN"/>
             </w:rPr>
           </w:pPr>
-          <w:hyperlink w:anchor="_Toc207349464" w:history="1">
+          <w:hyperlink w:anchor="_Toc208146881" w:history="1">
             <w:r>
               <w:rPr>
                 <w:rStyle w:val="Hyperlink"/>
@@ -281,7 +283,7 @@
                 <w:noProof/>
                 <w:webHidden/>
               </w:rPr>
-              <w:instrText xml:space="preserve"> PAGEREF _Toc207349464 \h </w:instrText>
+              <w:instrText xml:space="preserve"> PAGEREF _Toc208146881 \h </w:instrText>
             </w:r>
             <w:r>
               <w:rPr>
@@ -302,6 +304,276 @@
                 <w:webHidden/>
               </w:rPr>
               <w:t>2</w:t>
+            </w:r>
+            <w:r>
+              <w:rPr>
+                <w:noProof/>
+                <w:webHidden/>
+              </w:rPr>
+              <w:fldChar w:fldCharType="end"/>
+            </w:r>
+          </w:hyperlink>
+        </w:p>
+        <w:p>
+          <w:pPr>
+            <w:pStyle w:val="TOC2"/>
+            <w:tabs>
+              <w:tab w:val="left" w:pos="720"/>
+              <w:tab w:val="right" w:leader="dot" w:pos="10456"/>
+            </w:tabs>
+            <w:rPr>
+              <w:rFonts w:eastAsiaTheme="minorEastAsia"/>
+              <w:noProof/>
+              <w:sz w:val="24"/>
+              <w:szCs w:val="24"/>
+              <w:lang w:eastAsia="en-IN"/>
+            </w:rPr>
+          </w:pPr>
+          <w:hyperlink w:anchor="_Toc208146882" w:history="1">
+            <w:r>
+              <w:rPr>
+                <w:rStyle w:val="Hyperlink"/>
+                <w:noProof/>
+              </w:rPr>
+              <w:t>4.</w:t>
+            </w:r>
+            <w:r>
+              <w:rPr>
+                <w:rFonts w:eastAsiaTheme="minorEastAsia"/>
+                <w:noProof/>
+                <w:sz w:val="24"/>
+                <w:szCs w:val="24"/>
+                <w:lang w:eastAsia="en-IN"/>
+              </w:rPr>
+              <w:tab/>
+            </w:r>
+            <w:r>
+              <w:rPr>
+                <w:rStyle w:val="Hyperlink"/>
+                <w:noProof/>
+              </w:rPr>
+              <w:t>What is the difference between save(), saveOrUpdate(), and persist() in Hibernate?</w:t>
+            </w:r>
+            <w:r>
+              <w:rPr>
+                <w:noProof/>
+                <w:webHidden/>
+              </w:rPr>
+              <w:tab/>
+            </w:r>
+            <w:r>
+              <w:rPr>
+                <w:noProof/>
+                <w:webHidden/>
+              </w:rPr>
+              <w:fldChar w:fldCharType="begin"/>
+            </w:r>
+            <w:r>
+              <w:rPr>
+                <w:noProof/>
+                <w:webHidden/>
+              </w:rPr>
+              <w:instrText xml:space="preserve"> PAGEREF _Toc208146882 \h </w:instrText>
+            </w:r>
+            <w:r>
+              <w:rPr>
+                <w:noProof/>
+                <w:webHidden/>
+              </w:rPr>
+            </w:r>
+            <w:r>
+              <w:rPr>
+                <w:noProof/>
+                <w:webHidden/>
+              </w:rPr>
+              <w:fldChar w:fldCharType="separate"/>
+            </w:r>
+            <w:r>
+              <w:rPr>
+                <w:noProof/>
+                <w:webHidden/>
+              </w:rPr>
+              <w:t>4</w:t>
+            </w:r>
+            <w:r>
+              <w:rPr>
+                <w:noProof/>
+                <w:webHidden/>
+              </w:rPr>
+              <w:fldChar w:fldCharType="end"/>
+            </w:r>
+          </w:hyperlink>
+        </w:p>
+        <w:p>
+          <w:pPr>
+            <w:pStyle w:val="TOC2"/>
+            <w:tabs>
+              <w:tab w:val="left" w:pos="720"/>
+              <w:tab w:val="right" w:leader="dot" w:pos="10456"/>
+            </w:tabs>
+            <w:rPr>
+              <w:rFonts w:eastAsiaTheme="minorEastAsia"/>
+              <w:noProof/>
+              <w:sz w:val="24"/>
+              <w:szCs w:val="24"/>
+              <w:lang w:eastAsia="en-IN"/>
+            </w:rPr>
+          </w:pPr>
+          <w:hyperlink w:anchor="_Toc208146883" w:history="1">
+            <w:r>
+              <w:rPr>
+                <w:rStyle w:val="Hyperlink"/>
+                <w:noProof/>
+              </w:rPr>
+              <w:t>5.</w:t>
+            </w:r>
+            <w:r>
+              <w:rPr>
+                <w:rFonts w:eastAsiaTheme="minorEastAsia"/>
+                <w:noProof/>
+                <w:sz w:val="24"/>
+                <w:szCs w:val="24"/>
+                <w:lang w:eastAsia="en-IN"/>
+              </w:rPr>
+              <w:tab/>
+            </w:r>
+            <w:r>
+              <w:rPr>
+                <w:rStyle w:val="Hyperlink"/>
+                <w:noProof/>
+              </w:rPr>
+              <w:t>Explain optimistic vs pessimistic locking in JPA</w:t>
+            </w:r>
+            <w:r>
+              <w:rPr>
+                <w:noProof/>
+                <w:webHidden/>
+              </w:rPr>
+              <w:tab/>
+            </w:r>
+            <w:r>
+              <w:rPr>
+                <w:noProof/>
+                <w:webHidden/>
+              </w:rPr>
+              <w:fldChar w:fldCharType="begin"/>
+            </w:r>
+            <w:r>
+              <w:rPr>
+                <w:noProof/>
+                <w:webHidden/>
+              </w:rPr>
+              <w:instrText xml:space="preserve"> PAGEREF _Toc208146883 \h </w:instrText>
+            </w:r>
+            <w:r>
+              <w:rPr>
+                <w:noProof/>
+                <w:webHidden/>
+              </w:rPr>
+            </w:r>
+            <w:r>
+              <w:rPr>
+                <w:noProof/>
+                <w:webHidden/>
+              </w:rPr>
+              <w:fldChar w:fldCharType="separate"/>
+            </w:r>
+            <w:r>
+              <w:rPr>
+                <w:noProof/>
+                <w:webHidden/>
+              </w:rPr>
+              <w:t>4</w:t>
+            </w:r>
+            <w:r>
+              <w:rPr>
+                <w:noProof/>
+                <w:webHidden/>
+              </w:rPr>
+              <w:fldChar w:fldCharType="end"/>
+            </w:r>
+          </w:hyperlink>
+        </w:p>
+        <w:p>
+          <w:pPr>
+            <w:pStyle w:val="TOC2"/>
+            <w:tabs>
+              <w:tab w:val="left" w:pos="720"/>
+              <w:tab w:val="right" w:leader="dot" w:pos="10456"/>
+            </w:tabs>
+            <w:rPr>
+              <w:rFonts w:eastAsiaTheme="minorEastAsia"/>
+              <w:noProof/>
+              <w:sz w:val="24"/>
+              <w:szCs w:val="24"/>
+              <w:lang w:eastAsia="en-IN"/>
+            </w:rPr>
+          </w:pPr>
+          <w:hyperlink w:anchor="_Toc208146884" w:history="1">
+            <w:r>
+              <w:rPr>
+                <w:rStyle w:val="Hyperlink"/>
+                <w:noProof/>
+              </w:rPr>
+              <w:t>6.</w:t>
+            </w:r>
+            <w:r>
+              <w:rPr>
+                <w:rFonts w:eastAsiaTheme="minorEastAsia"/>
+                <w:noProof/>
+                <w:sz w:val="24"/>
+                <w:szCs w:val="24"/>
+                <w:lang w:eastAsia="en-IN"/>
+              </w:rPr>
+              <w:tab/>
+            </w:r>
+            <w:r>
+              <w:rPr>
+                <w:rStyle w:val="Hyperlink"/>
+                <w:noProof/>
+              </w:rPr>
+              <w:t>What is the difference between native query and JPQL?</w:t>
+            </w:r>
+            <w:r>
+              <w:rPr>
+                <w:noProof/>
+                <w:webHidden/>
+              </w:rPr>
+              <w:tab/>
+            </w:r>
+            <w:r>
+              <w:rPr>
+                <w:noProof/>
+                <w:webHidden/>
+              </w:rPr>
+              <w:fldChar w:fldCharType="begin"/>
+            </w:r>
+            <w:r>
+              <w:rPr>
+                <w:noProof/>
+                <w:webHidden/>
+              </w:rPr>
+              <w:instrText xml:space="preserve"> PAGEREF _Toc208146884 \h </w:instrText>
+            </w:r>
+            <w:r>
+              <w:rPr>
+                <w:noProof/>
+                <w:webHidden/>
+              </w:rPr>
+            </w:r>
+            <w:r>
+              <w:rPr>
+                <w:noProof/>
+                <w:webHidden/>
+              </w:rPr>
+              <w:fldChar w:fldCharType="separate"/>
+            </w:r>
+            <w:r>
+              <w:rPr>
+                <w:noProof/>
+                <w:webHidden/>
+              </w:rPr>
+              <w:t>5</w:t>
             </w:r>
             <w:r>
               <w:rPr>
@@ -362,7 +634,7 @@
           <w:numId w:val="2"/>
         </w:numPr>
       </w:pPr>
-      <w:bookmarkStart w:id="0" w:name="_Toc207349462"/>
+      <w:bookmarkStart w:id="0" w:name="_Toc208146879"/>
       <w:r>
         <w:t>What is hibernate?</w:t>
       </w:r>
@@ -389,7 +661,7 @@
           <w:numId w:val="2"/>
         </w:numPr>
       </w:pPr>
-      <w:bookmarkStart w:id="1" w:name="_Toc207349463"/>
+      <w:bookmarkStart w:id="1" w:name="_Toc208146880"/>
       <w:r>
         <w:t>Explain the first level, second level and third level cache in hibernate</w:t>
       </w:r>
@@ -435,7 +707,7 @@
           <w:numId w:val="2"/>
         </w:numPr>
       </w:pPr>
-      <w:bookmarkStart w:id="2" w:name="_Toc207349464"/>
+      <w:bookmarkStart w:id="2" w:name="_Toc208146881"/>
       <w:r>
         <w:t>How does the hibernate handle the transaction</w:t>
       </w:r>
@@ -826,6 +1098,7 @@
         <w:ind w:left="720"/>
       </w:pPr>
       <w:r>
+        <w:lastRenderedPageBreak/>
         <w:t xml:space="preserve">            // Commit transaction</w:t>
       </w:r>
     </w:p>
@@ -865,7 +1138,6 @@
         <w:ind w:left="720"/>
       </w:pPr>
       <w:r>
-        <w:lastRenderedPageBreak/>
         <w:t xml:space="preserve">            if (</w:t>
       </w:r>
       <w:proofErr w:type="spellStart"/>
@@ -1359,6 +1631,2012 @@
         <w:ind w:left="720"/>
       </w:pPr>
     </w:p>
+    <w:p>
+      <w:pPr>
+        <w:pStyle w:val="Heading2"/>
+        <w:numPr>
+          <w:ilvl w:val="0"/>
+          <w:numId w:val="2"/>
+        </w:numPr>
+      </w:pPr>
+      <w:bookmarkStart w:id="3" w:name="_Toc208146882"/>
+      <w:r>
+        <w:lastRenderedPageBreak/>
+        <w:t xml:space="preserve">What is the difference between </w:t>
+      </w:r>
+      <w:proofErr w:type="gramStart"/>
+      <w:r>
+        <w:t>save(</w:t>
+      </w:r>
+      <w:proofErr w:type="gramEnd"/>
+      <w:r>
+        <w:t xml:space="preserve">), </w:t>
+      </w:r>
+      <w:proofErr w:type="spellStart"/>
+      <w:proofErr w:type="gramStart"/>
+      <w:r>
+        <w:t>saveOrUpdate</w:t>
+      </w:r>
+      <w:proofErr w:type="spellEnd"/>
+      <w:r>
+        <w:t>(</w:t>
+      </w:r>
+      <w:proofErr w:type="gramEnd"/>
+      <w:r>
+        <w:t xml:space="preserve">), and </w:t>
+      </w:r>
+      <w:proofErr w:type="gramStart"/>
+      <w:r>
+        <w:t>persist(</w:t>
+      </w:r>
+      <w:proofErr w:type="gramEnd"/>
+      <w:r>
+        <w:t>) in Hibernate?</w:t>
+      </w:r>
+      <w:bookmarkEnd w:id="3"/>
+    </w:p>
+    <w:p/>
+    <w:tbl>
+      <w:tblPr>
+        <w:tblW w:w="0" w:type="auto"/>
+        <w:tblCellSpacing w:w="15" w:type="dxa"/>
+        <w:tblBorders>
+          <w:top w:val="single" w:sz="4" w:space="0" w:color="auto"/>
+          <w:left w:val="single" w:sz="4" w:space="0" w:color="auto"/>
+          <w:bottom w:val="single" w:sz="4" w:space="0" w:color="auto"/>
+          <w:right w:val="single" w:sz="4" w:space="0" w:color="auto"/>
+          <w:insideH w:val="single" w:sz="4" w:space="0" w:color="auto"/>
+          <w:insideV w:val="single" w:sz="4" w:space="0" w:color="auto"/>
+        </w:tblBorders>
+        <w:tblCellMar>
+          <w:top w:w="15" w:type="dxa"/>
+          <w:left w:w="15" w:type="dxa"/>
+          <w:bottom w:w="15" w:type="dxa"/>
+          <w:right w:w="15" w:type="dxa"/>
+        </w:tblCellMar>
+        <w:tblLook w:val="04A0" w:firstRow="1" w:lastRow="0" w:firstColumn="1" w:lastColumn="0" w:noHBand="0" w:noVBand="1"/>
+      </w:tblPr>
+      <w:tblGrid>
+        <w:gridCol w:w="1705"/>
+        <w:gridCol w:w="3251"/>
+        <w:gridCol w:w="2574"/>
+        <w:gridCol w:w="2926"/>
+      </w:tblGrid>
+      <w:tr>
+        <w:trPr>
+          <w:tblHeader/>
+          <w:tblCellSpacing w:w="15" w:type="dxa"/>
+        </w:trPr>
+        <w:tc>
+          <w:tcPr>
+            <w:tcW w:w="0" w:type="auto"/>
+            <w:vAlign w:val="center"/>
+            <w:hideMark/>
+          </w:tcPr>
+          <w:p>
+            <w:pPr>
+              <w:rPr>
+                <w:b/>
+                <w:bCs/>
+              </w:rPr>
+            </w:pPr>
+            <w:r>
+              <w:rPr>
+                <w:b/>
+                <w:bCs/>
+              </w:rPr>
+              <w:t>Aspect</w:t>
+            </w:r>
+          </w:p>
+        </w:tc>
+        <w:tc>
+          <w:tcPr>
+            <w:tcW w:w="0" w:type="auto"/>
+            <w:vAlign w:val="center"/>
+            <w:hideMark/>
+          </w:tcPr>
+          <w:p>
+            <w:pPr>
+              <w:rPr>
+                <w:b/>
+                <w:bCs/>
+              </w:rPr>
+            </w:pPr>
+            <w:proofErr w:type="gramStart"/>
+            <w:r>
+              <w:rPr>
+                <w:b/>
+                <w:bCs/>
+              </w:rPr>
+              <w:t>save(</w:t>
+            </w:r>
+            <w:proofErr w:type="gramEnd"/>
+            <w:r>
+              <w:rPr>
+                <w:b/>
+                <w:bCs/>
+              </w:rPr>
+              <w:t>)</w:t>
+            </w:r>
+          </w:p>
+        </w:tc>
+        <w:tc>
+          <w:tcPr>
+            <w:tcW w:w="0" w:type="auto"/>
+            <w:vAlign w:val="center"/>
+            <w:hideMark/>
+          </w:tcPr>
+          <w:p>
+            <w:pPr>
+              <w:rPr>
+                <w:b/>
+                <w:bCs/>
+              </w:rPr>
+            </w:pPr>
+            <w:proofErr w:type="spellStart"/>
+            <w:proofErr w:type="gramStart"/>
+            <w:r>
+              <w:rPr>
+                <w:b/>
+                <w:bCs/>
+              </w:rPr>
+              <w:t>saveOrUpdate</w:t>
+            </w:r>
+            <w:proofErr w:type="spellEnd"/>
+            <w:r>
+              <w:rPr>
+                <w:b/>
+                <w:bCs/>
+              </w:rPr>
+              <w:t>(</w:t>
+            </w:r>
+            <w:proofErr w:type="gramEnd"/>
+            <w:r>
+              <w:rPr>
+                <w:b/>
+                <w:bCs/>
+              </w:rPr>
+              <w:t>)</w:t>
+            </w:r>
+          </w:p>
+        </w:tc>
+        <w:tc>
+          <w:tcPr>
+            <w:tcW w:w="0" w:type="auto"/>
+            <w:vAlign w:val="center"/>
+            <w:hideMark/>
+          </w:tcPr>
+          <w:p>
+            <w:pPr>
+              <w:rPr>
+                <w:b/>
+                <w:bCs/>
+              </w:rPr>
+            </w:pPr>
+            <w:proofErr w:type="gramStart"/>
+            <w:r>
+              <w:rPr>
+                <w:b/>
+                <w:bCs/>
+              </w:rPr>
+              <w:t>persist(</w:t>
+            </w:r>
+            <w:proofErr w:type="gramEnd"/>
+            <w:r>
+              <w:rPr>
+                <w:b/>
+                <w:bCs/>
+              </w:rPr>
+              <w:t>)</w:t>
+            </w:r>
+          </w:p>
+        </w:tc>
+      </w:tr>
+      <w:tr>
+        <w:trPr>
+          <w:tblCellSpacing w:w="15" w:type="dxa"/>
+        </w:trPr>
+        <w:tc>
+          <w:tcPr>
+            <w:tcW w:w="0" w:type="auto"/>
+            <w:vAlign w:val="center"/>
+            <w:hideMark/>
+          </w:tcPr>
+          <w:p>
+            <w:r>
+              <w:rPr>
+                <w:b/>
+                <w:bCs/>
+              </w:rPr>
+              <w:t>Framework</w:t>
+            </w:r>
+          </w:p>
+        </w:tc>
+        <w:tc>
+          <w:tcPr>
+            <w:tcW w:w="0" w:type="auto"/>
+            <w:vAlign w:val="center"/>
+            <w:hideMark/>
+          </w:tcPr>
+          <w:p>
+            <w:r>
+              <w:t>Hibernate-only</w:t>
+            </w:r>
+          </w:p>
+        </w:tc>
+        <w:tc>
+          <w:tcPr>
+            <w:tcW w:w="0" w:type="auto"/>
+            <w:vAlign w:val="center"/>
+            <w:hideMark/>
+          </w:tcPr>
+          <w:p>
+            <w:r>
+              <w:t>Hibernate-only</w:t>
+            </w:r>
+          </w:p>
+        </w:tc>
+        <w:tc>
+          <w:tcPr>
+            <w:tcW w:w="0" w:type="auto"/>
+            <w:vAlign w:val="center"/>
+            <w:hideMark/>
+          </w:tcPr>
+          <w:p>
+            <w:r>
+              <w:t>JPA standard</w:t>
+            </w:r>
+          </w:p>
+        </w:tc>
+      </w:tr>
+      <w:tr>
+        <w:trPr>
+          <w:tblCellSpacing w:w="15" w:type="dxa"/>
+        </w:trPr>
+        <w:tc>
+          <w:tcPr>
+            <w:tcW w:w="0" w:type="auto"/>
+            <w:vAlign w:val="center"/>
+            <w:hideMark/>
+          </w:tcPr>
+          <w:p>
+            <w:r>
+              <w:rPr>
+                <w:b/>
+                <w:bCs/>
+              </w:rPr>
+              <w:t>Entity State Supported</w:t>
+            </w:r>
+          </w:p>
+        </w:tc>
+        <w:tc>
+          <w:tcPr>
+            <w:tcW w:w="0" w:type="auto"/>
+            <w:vAlign w:val="center"/>
+            <w:hideMark/>
+          </w:tcPr>
+          <w:p>
+            <w:r>
+              <w:t xml:space="preserve">Only </w:t>
+            </w:r>
+            <w:r>
+              <w:rPr>
+                <w:b/>
+                <w:bCs/>
+              </w:rPr>
+              <w:t>Transient</w:t>
+            </w:r>
+            <w:r>
+              <w:t xml:space="preserve"> (new)</w:t>
+            </w:r>
+          </w:p>
+        </w:tc>
+        <w:tc>
+          <w:tcPr>
+            <w:tcW w:w="0" w:type="auto"/>
+            <w:vAlign w:val="center"/>
+            <w:hideMark/>
+          </w:tcPr>
+          <w:p>
+            <w:r>
+              <w:rPr>
+                <w:b/>
+                <w:bCs/>
+              </w:rPr>
+              <w:t>Transient</w:t>
+            </w:r>
+            <w:r>
+              <w:t xml:space="preserve"> and </w:t>
+            </w:r>
+            <w:proofErr w:type="gramStart"/>
+            <w:r>
+              <w:rPr>
+                <w:b/>
+                <w:bCs/>
+              </w:rPr>
+              <w:t>Detached</w:t>
+            </w:r>
+            <w:proofErr w:type="gramEnd"/>
+          </w:p>
+        </w:tc>
+        <w:tc>
+          <w:tcPr>
+            <w:tcW w:w="0" w:type="auto"/>
+            <w:vAlign w:val="center"/>
+            <w:hideMark/>
+          </w:tcPr>
+          <w:p>
+            <w:r>
+              <w:t xml:space="preserve">Only </w:t>
+            </w:r>
+            <w:r>
+              <w:rPr>
+                <w:b/>
+                <w:bCs/>
+              </w:rPr>
+              <w:t>Transient</w:t>
+            </w:r>
+            <w:r>
+              <w:t xml:space="preserve"> (new)</w:t>
+            </w:r>
+          </w:p>
+        </w:tc>
+      </w:tr>
+      <w:tr>
+        <w:trPr>
+          <w:tblCellSpacing w:w="15" w:type="dxa"/>
+        </w:trPr>
+        <w:tc>
+          <w:tcPr>
+            <w:tcW w:w="0" w:type="auto"/>
+            <w:vAlign w:val="center"/>
+            <w:hideMark/>
+          </w:tcPr>
+          <w:p>
+            <w:r>
+              <w:rPr>
+                <w:b/>
+                <w:bCs/>
+              </w:rPr>
+              <w:t>Operation</w:t>
+            </w:r>
+          </w:p>
+        </w:tc>
+        <w:tc>
+          <w:tcPr>
+            <w:tcW w:w="0" w:type="auto"/>
+            <w:vAlign w:val="center"/>
+            <w:hideMark/>
+          </w:tcPr>
+          <w:p>
+            <w:r>
+              <w:t xml:space="preserve">Always performs </w:t>
+            </w:r>
+            <w:r>
+              <w:rPr>
+                <w:b/>
+                <w:bCs/>
+              </w:rPr>
+              <w:t>INSERT</w:t>
+            </w:r>
+          </w:p>
+        </w:tc>
+        <w:tc>
+          <w:tcPr>
+            <w:tcW w:w="0" w:type="auto"/>
+            <w:vAlign w:val="center"/>
+            <w:hideMark/>
+          </w:tcPr>
+          <w:p>
+            <w:r>
+              <w:t xml:space="preserve">Performs </w:t>
+            </w:r>
+            <w:r>
+              <w:rPr>
+                <w:b/>
+                <w:bCs/>
+              </w:rPr>
+              <w:t>INSERT</w:t>
+            </w:r>
+            <w:r>
+              <w:t xml:space="preserve"> if entity is new, </w:t>
+            </w:r>
+            <w:r>
+              <w:rPr>
+                <w:b/>
+                <w:bCs/>
+              </w:rPr>
+              <w:t>UPDATE</w:t>
+            </w:r>
+            <w:r>
+              <w:t xml:space="preserve"> if entity exists</w:t>
+            </w:r>
+          </w:p>
+        </w:tc>
+        <w:tc>
+          <w:tcPr>
+            <w:tcW w:w="0" w:type="auto"/>
+            <w:vAlign w:val="center"/>
+            <w:hideMark/>
+          </w:tcPr>
+          <w:p>
+            <w:r>
+              <w:t xml:space="preserve">Performs only </w:t>
+            </w:r>
+            <w:r>
+              <w:rPr>
+                <w:b/>
+                <w:bCs/>
+              </w:rPr>
+              <w:t>INSERT</w:t>
+            </w:r>
+            <w:r>
+              <w:t xml:space="preserve"> (delayed until flush/commit)</w:t>
+            </w:r>
+          </w:p>
+        </w:tc>
+      </w:tr>
+      <w:tr>
+        <w:trPr>
+          <w:tblCellSpacing w:w="15" w:type="dxa"/>
+        </w:trPr>
+        <w:tc>
+          <w:tcPr>
+            <w:tcW w:w="0" w:type="auto"/>
+            <w:vAlign w:val="center"/>
+            <w:hideMark/>
+          </w:tcPr>
+          <w:p>
+            <w:r>
+              <w:rPr>
+                <w:b/>
+                <w:bCs/>
+              </w:rPr>
+              <w:t>Return Value</w:t>
+            </w:r>
+          </w:p>
+        </w:tc>
+        <w:tc>
+          <w:tcPr>
+            <w:tcW w:w="0" w:type="auto"/>
+            <w:vAlign w:val="center"/>
+            <w:hideMark/>
+          </w:tcPr>
+          <w:p>
+            <w:r>
+              <w:t>Returns generated identifier (Serializable)</w:t>
+            </w:r>
+          </w:p>
+        </w:tc>
+        <w:tc>
+          <w:tcPr>
+            <w:tcW w:w="0" w:type="auto"/>
+            <w:vAlign w:val="center"/>
+            <w:hideMark/>
+          </w:tcPr>
+          <w:p>
+            <w:r>
+              <w:t>void (no return)</w:t>
+            </w:r>
+          </w:p>
+        </w:tc>
+        <w:tc>
+          <w:tcPr>
+            <w:tcW w:w="0" w:type="auto"/>
+            <w:vAlign w:val="center"/>
+            <w:hideMark/>
+          </w:tcPr>
+          <w:p>
+            <w:r>
+              <w:t>void (no return)</w:t>
+            </w:r>
+          </w:p>
+        </w:tc>
+      </w:tr>
+      <w:tr>
+        <w:trPr>
+          <w:tblCellSpacing w:w="15" w:type="dxa"/>
+        </w:trPr>
+        <w:tc>
+          <w:tcPr>
+            <w:tcW w:w="0" w:type="auto"/>
+            <w:vAlign w:val="center"/>
+            <w:hideMark/>
+          </w:tcPr>
+          <w:p>
+            <w:r>
+              <w:rPr>
+                <w:b/>
+                <w:bCs/>
+              </w:rPr>
+              <w:t>When SQL Executes</w:t>
+            </w:r>
+          </w:p>
+        </w:tc>
+        <w:tc>
+          <w:tcPr>
+            <w:tcW w:w="0" w:type="auto"/>
+            <w:vAlign w:val="center"/>
+            <w:hideMark/>
+          </w:tcPr>
+          <w:p>
+            <w:r>
+              <w:t>Insert scheduled, but ID generated immediately</w:t>
+            </w:r>
+          </w:p>
+        </w:tc>
+        <w:tc>
+          <w:tcPr>
+            <w:tcW w:w="0" w:type="auto"/>
+            <w:vAlign w:val="center"/>
+            <w:hideMark/>
+          </w:tcPr>
+          <w:p>
+            <w:r>
+              <w:t>Insert/Update scheduled, executed on flush/commit</w:t>
+            </w:r>
+          </w:p>
+        </w:tc>
+        <w:tc>
+          <w:tcPr>
+            <w:tcW w:w="0" w:type="auto"/>
+            <w:vAlign w:val="center"/>
+            <w:hideMark/>
+          </w:tcPr>
+          <w:p>
+            <w:r>
+              <w:t>Insert scheduled, executed on flush/commit</w:t>
+            </w:r>
+          </w:p>
+        </w:tc>
+      </w:tr>
+      <w:tr>
+        <w:trPr>
+          <w:tblCellSpacing w:w="15" w:type="dxa"/>
+        </w:trPr>
+        <w:tc>
+          <w:tcPr>
+            <w:tcW w:w="0" w:type="auto"/>
+            <w:vAlign w:val="center"/>
+            <w:hideMark/>
+          </w:tcPr>
+          <w:p>
+            <w:r>
+              <w:rPr>
+                <w:b/>
+                <w:bCs/>
+              </w:rPr>
+              <w:t>If Entity Already Exists</w:t>
+            </w:r>
+          </w:p>
+        </w:tc>
+        <w:tc>
+          <w:tcPr>
+            <w:tcW w:w="0" w:type="auto"/>
+            <w:vAlign w:val="center"/>
+            <w:hideMark/>
+          </w:tcPr>
+          <w:p>
+            <w:r>
+              <w:t xml:space="preserve">Attempts another insert → may cause </w:t>
+            </w:r>
+            <w:r>
+              <w:rPr>
+                <w:b/>
+                <w:bCs/>
+              </w:rPr>
+              <w:t>duplicate/constraint violation</w:t>
+            </w:r>
+          </w:p>
+        </w:tc>
+        <w:tc>
+          <w:tcPr>
+            <w:tcW w:w="0" w:type="auto"/>
+            <w:vAlign w:val="center"/>
+            <w:hideMark/>
+          </w:tcPr>
+          <w:p>
+            <w:r>
+              <w:t>Updates the existing record</w:t>
+            </w:r>
+          </w:p>
+        </w:tc>
+        <w:tc>
+          <w:tcPr>
+            <w:tcW w:w="0" w:type="auto"/>
+            <w:vAlign w:val="center"/>
+            <w:hideMark/>
+          </w:tcPr>
+          <w:p>
+            <w:r>
+              <w:t xml:space="preserve">Throws </w:t>
+            </w:r>
+            <w:proofErr w:type="spellStart"/>
+            <w:r>
+              <w:rPr>
+                <w:b/>
+                <w:bCs/>
+              </w:rPr>
+              <w:t>EntityExistsException</w:t>
+            </w:r>
+            <w:proofErr w:type="spellEnd"/>
+          </w:p>
+        </w:tc>
+      </w:tr>
+      <w:tr>
+        <w:trPr>
+          <w:tblCellSpacing w:w="15" w:type="dxa"/>
+        </w:trPr>
+        <w:tc>
+          <w:tcPr>
+            <w:tcW w:w="0" w:type="auto"/>
+            <w:vAlign w:val="center"/>
+            <w:hideMark/>
+          </w:tcPr>
+          <w:p>
+            <w:r>
+              <w:rPr>
+                <w:b/>
+                <w:bCs/>
+              </w:rPr>
+              <w:t>Transaction Requirement</w:t>
+            </w:r>
+          </w:p>
+        </w:tc>
+        <w:tc>
+          <w:tcPr>
+            <w:tcW w:w="0" w:type="auto"/>
+            <w:vAlign w:val="center"/>
+            <w:hideMark/>
+          </w:tcPr>
+          <w:p>
+            <w:r>
+              <w:t>Not strictly required (but without commit, changes won’t persist)</w:t>
+            </w:r>
+          </w:p>
+        </w:tc>
+        <w:tc>
+          <w:tcPr>
+            <w:tcW w:w="0" w:type="auto"/>
+            <w:vAlign w:val="center"/>
+            <w:hideMark/>
+          </w:tcPr>
+          <w:p>
+            <w:r>
+              <w:t>Transaction required</w:t>
+            </w:r>
+          </w:p>
+        </w:tc>
+        <w:tc>
+          <w:tcPr>
+            <w:tcW w:w="0" w:type="auto"/>
+            <w:vAlign w:val="center"/>
+            <w:hideMark/>
+          </w:tcPr>
+          <w:p>
+            <w:r>
+              <w:t>Transaction required (JPA spec)</w:t>
+            </w:r>
+          </w:p>
+        </w:tc>
+      </w:tr>
+      <w:tr>
+        <w:trPr>
+          <w:tblCellSpacing w:w="15" w:type="dxa"/>
+        </w:trPr>
+        <w:tc>
+          <w:tcPr>
+            <w:tcW w:w="0" w:type="auto"/>
+            <w:vAlign w:val="center"/>
+            <w:hideMark/>
+          </w:tcPr>
+          <w:p>
+            <w:r>
+              <w:rPr>
+                <w:b/>
+                <w:bCs/>
+              </w:rPr>
+              <w:t>Use Case</w:t>
+            </w:r>
+          </w:p>
+        </w:tc>
+        <w:tc>
+          <w:tcPr>
+            <w:tcW w:w="0" w:type="auto"/>
+            <w:vAlign w:val="center"/>
+            <w:hideMark/>
+          </w:tcPr>
+          <w:p>
+            <w:r>
+              <w:t xml:space="preserve">When you need the generated </w:t>
+            </w:r>
+            <w:r>
+              <w:rPr>
+                <w:b/>
+                <w:bCs/>
+              </w:rPr>
+              <w:t>ID immediately</w:t>
+            </w:r>
+            <w:r>
+              <w:t xml:space="preserve"> for a new entity</w:t>
+            </w:r>
+          </w:p>
+        </w:tc>
+        <w:tc>
+          <w:tcPr>
+            <w:tcW w:w="0" w:type="auto"/>
+            <w:vAlign w:val="center"/>
+            <w:hideMark/>
+          </w:tcPr>
+          <w:p>
+            <w:r>
+              <w:t xml:space="preserve">When unsure if entity is </w:t>
+            </w:r>
+            <w:r>
+              <w:rPr>
+                <w:b/>
+                <w:bCs/>
+              </w:rPr>
+              <w:t>new or existing</w:t>
+            </w:r>
+          </w:p>
+        </w:tc>
+        <w:tc>
+          <w:tcPr>
+            <w:tcW w:w="0" w:type="auto"/>
+            <w:vAlign w:val="center"/>
+            <w:hideMark/>
+          </w:tcPr>
+          <w:p>
+            <w:r>
+              <w:t xml:space="preserve">For </w:t>
+            </w:r>
+            <w:r>
+              <w:rPr>
+                <w:b/>
+                <w:bCs/>
+              </w:rPr>
+              <w:t>portable, JPA-compliant</w:t>
+            </w:r>
+            <w:r>
+              <w:t xml:space="preserve"> insertion</w:t>
+            </w:r>
+          </w:p>
+        </w:tc>
+      </w:tr>
+    </w:tbl>
+    <w:p/>
+    <w:p>
+      <w:pPr>
+        <w:pStyle w:val="Heading2"/>
+        <w:numPr>
+          <w:ilvl w:val="0"/>
+          <w:numId w:val="2"/>
+        </w:numPr>
+      </w:pPr>
+      <w:bookmarkStart w:id="4" w:name="_Toc208146883"/>
+      <w:r>
+        <w:t>Explain optimistic vs pessimistic locking in JPA</w:t>
+      </w:r>
+      <w:bookmarkEnd w:id="4"/>
+    </w:p>
+    <w:p>
+      <w:pPr>
+        <w:pStyle w:val="ListParagraph"/>
+        <w:numPr>
+          <w:ilvl w:val="0"/>
+          <w:numId w:val="3"/>
+        </w:numPr>
+        <w:rPr>
+          <w:b/>
+          <w:bCs/>
+        </w:rPr>
+      </w:pPr>
+      <w:r>
+        <w:rPr>
+          <w:b/>
+          <w:bCs/>
+        </w:rPr>
+        <w:t>Optimistic Locking</w:t>
+      </w:r>
+    </w:p>
+    <w:p>
+      <w:pPr>
+        <w:ind w:left="720" w:firstLine="360"/>
+        <w:jc w:val="both"/>
+      </w:pPr>
+      <w:r>
+        <w:t xml:space="preserve">Optimistic locking works on the assumption that conflicts between concurrent transactions are </w:t>
+      </w:r>
+      <w:r>
+        <w:rPr>
+          <w:b/>
+          <w:bCs/>
+        </w:rPr>
+        <w:t>rare</w:t>
+      </w:r>
+      <w:r>
+        <w:t>. Instead of locking the database row at the time of reading, it allows multiple transactions to read the same data freely. The system only checks for conflicts when the transaction is about to commit.</w:t>
+      </w:r>
+    </w:p>
+    <w:p>
+      <w:pPr>
+        <w:ind w:left="720" w:firstLine="360"/>
+        <w:jc w:val="both"/>
+      </w:pPr>
+      <w:r>
+        <w:t xml:space="preserve">This mechanism relies on a special column in the entity, usually annotated with </w:t>
+      </w:r>
+      <w:r>
+        <w:t>@Version</w:t>
+      </w:r>
+      <w:r>
+        <w:t xml:space="preserve">. Every time an update is made, JPA automatically increments the version. When a transaction tries to commit, Hibernate or JPA compares the version in memory with the version in the database. If they match, the update </w:t>
+      </w:r>
+      <w:proofErr w:type="gramStart"/>
+      <w:r>
+        <w:t>succeeds</w:t>
+      </w:r>
+      <w:proofErr w:type="gramEnd"/>
+      <w:r>
+        <w:t xml:space="preserve"> and the version is incremented. If not, an </w:t>
+      </w:r>
+      <w:proofErr w:type="spellStart"/>
+      <w:r>
+        <w:t>OptimisticLockException</w:t>
+      </w:r>
+      <w:proofErr w:type="spellEnd"/>
+      <w:r>
+        <w:t xml:space="preserve"> is thrown, meaning another transaction has already modified the data.</w:t>
+      </w:r>
+    </w:p>
+    <w:p>
+      <w:pPr>
+        <w:ind w:left="720" w:firstLine="360"/>
+        <w:jc w:val="both"/>
+      </w:pPr>
+      <w:r>
+        <w:t xml:space="preserve">Optimistic locking is highly efficient in systems where </w:t>
+      </w:r>
+      <w:r>
+        <w:rPr>
+          <w:b/>
+          <w:bCs/>
+        </w:rPr>
+        <w:t xml:space="preserve">read operations dominate </w:t>
+      </w:r>
+      <w:proofErr w:type="gramStart"/>
+      <w:r>
+        <w:rPr>
+          <w:b/>
+          <w:bCs/>
+        </w:rPr>
+        <w:t>over write</w:t>
+      </w:r>
+      <w:proofErr w:type="gramEnd"/>
+      <w:r>
+        <w:rPr>
+          <w:b/>
+          <w:bCs/>
+        </w:rPr>
+        <w:t xml:space="preserve"> operations</w:t>
+      </w:r>
+      <w:r>
+        <w:t xml:space="preserve">, such as online product </w:t>
+      </w:r>
+      <w:proofErr w:type="spellStart"/>
+      <w:r>
+        <w:t>catalogs</w:t>
+      </w:r>
+      <w:proofErr w:type="spellEnd"/>
+      <w:r>
+        <w:t xml:space="preserve"> or user profile management. It provides high concurrency since it does not block other transactions, but it may require retrying transactions when conflicts are detected.</w:t>
+      </w:r>
+    </w:p>
+    <w:p>
+      <w:pPr>
+        <w:pStyle w:val="ListParagraph"/>
+        <w:numPr>
+          <w:ilvl w:val="0"/>
+          <w:numId w:val="3"/>
+        </w:numPr>
+      </w:pPr>
+      <w:r>
+        <w:rPr>
+          <w:b/>
+          <w:bCs/>
+        </w:rPr>
+        <w:t>Pessimistic</w:t>
+      </w:r>
+      <w:r>
+        <w:t xml:space="preserve"> </w:t>
+      </w:r>
+      <w:r>
+        <w:rPr>
+          <w:b/>
+          <w:bCs/>
+        </w:rPr>
+        <w:t>Locking</w:t>
+      </w:r>
+    </w:p>
+    <w:p>
+      <w:pPr>
+        <w:ind w:left="720" w:firstLine="360"/>
+        <w:jc w:val="both"/>
+      </w:pPr>
+      <w:r>
+        <w:t xml:space="preserve">Pessimistic locking works on the opposite assumption: that </w:t>
+      </w:r>
+      <w:r>
+        <w:rPr>
+          <w:b/>
+          <w:bCs/>
+        </w:rPr>
+        <w:t>conflicts are likely to happen</w:t>
+      </w:r>
+      <w:r>
+        <w:t xml:space="preserve">. It prevents conflicts by acquiring a </w:t>
+      </w:r>
+      <w:r>
+        <w:rPr>
+          <w:b/>
+          <w:bCs/>
+        </w:rPr>
+        <w:t>lock on the database row</w:t>
+      </w:r>
+      <w:r>
+        <w:t xml:space="preserve"> as soon as it is read. This lock ensures that </w:t>
+      </w:r>
+      <w:r>
+        <w:lastRenderedPageBreak/>
+        <w:t>no other transaction can modify (and sometimes even read) the same row until the first transaction is completed.</w:t>
+      </w:r>
+    </w:p>
+    <w:p>
+      <w:pPr>
+        <w:ind w:left="720" w:firstLine="360"/>
+        <w:jc w:val="both"/>
+      </w:pPr>
+      <w:r>
+        <w:t xml:space="preserve">In JPA, pessimistic locking is implemented using lock modes such as </w:t>
+      </w:r>
+      <w:proofErr w:type="spellStart"/>
+      <w:r>
+        <w:t>LockModeType.PESSIMISTIC_READ</w:t>
+      </w:r>
+      <w:proofErr w:type="spellEnd"/>
+      <w:r>
+        <w:t xml:space="preserve">, </w:t>
+      </w:r>
+      <w:proofErr w:type="spellStart"/>
+      <w:r>
+        <w:t>LockModeType.PESSIMISTIC_WRITE</w:t>
+      </w:r>
+      <w:proofErr w:type="spellEnd"/>
+      <w:r>
+        <w:t xml:space="preserve">, or </w:t>
+      </w:r>
+      <w:proofErr w:type="spellStart"/>
+      <w:r>
+        <w:t>LockModeType.PESSIMISTIC_FORCE_INCREMENT</w:t>
+      </w:r>
+      <w:proofErr w:type="spellEnd"/>
+      <w:r>
+        <w:t xml:space="preserve">. Under the hood, these typically translate to SQL queries like </w:t>
+      </w:r>
+      <w:r>
+        <w:t>SELECT ... FOR UPDATE</w:t>
+      </w:r>
+      <w:r>
+        <w:t>. For example, if one transaction acquires a pessimistic write lock on a product row, any other transaction that tries to read or modify that row will be blocked until the lock is released.</w:t>
+      </w:r>
+    </w:p>
+    <w:p>
+      <w:pPr>
+        <w:ind w:left="720" w:firstLine="360"/>
+        <w:jc w:val="both"/>
+      </w:pPr>
+      <w:r>
+        <w:t xml:space="preserve">Pessimistic locking is more suitable for systems where </w:t>
+      </w:r>
+      <w:r>
+        <w:rPr>
+          <w:b/>
+          <w:bCs/>
+        </w:rPr>
+        <w:t>data integrity is critical and conflicts must be avoided at all costs</w:t>
+      </w:r>
+      <w:r>
+        <w:t>, such as banking transactions, seat reservations, or inventory management. However, it reduces concurrency and may lead to performance issues due to blocking or deadlocks.</w:t>
+      </w:r>
+    </w:p>
+    <w:p>
+      <w:pPr>
+        <w:ind w:left="720" w:firstLine="360"/>
+      </w:pPr>
+    </w:p>
+    <w:p>
+      <w:pPr>
+        <w:pStyle w:val="ListParagraph"/>
+        <w:numPr>
+          <w:ilvl w:val="0"/>
+          <w:numId w:val="3"/>
+        </w:numPr>
+      </w:pPr>
+      <w:r>
+        <w:rPr>
+          <w:rFonts w:ascii="Segoe UI Emoji" w:hAnsi="Segoe UI Emoji" w:cs="Segoe UI Emoji"/>
+        </w:rPr>
+        <w:t>🔎</w:t>
+      </w:r>
+      <w:r>
+        <w:t xml:space="preserve"> Key Difference</w:t>
+      </w:r>
+    </w:p>
+    <w:p>
+      <w:pPr>
+        <w:ind w:left="720" w:firstLine="360"/>
+        <w:jc w:val="both"/>
+      </w:pPr>
+      <w:r>
+        <w:t xml:space="preserve">In summary, </w:t>
+      </w:r>
+      <w:r>
+        <w:rPr>
+          <w:b/>
+          <w:bCs/>
+        </w:rPr>
+        <w:t>optimistic locking</w:t>
+      </w:r>
+      <w:r>
+        <w:t xml:space="preserve"> focuses on </w:t>
+      </w:r>
+      <w:r>
+        <w:rPr>
+          <w:b/>
+          <w:bCs/>
+        </w:rPr>
+        <w:t>detecting conflicts at commit time</w:t>
+      </w:r>
+      <w:r>
+        <w:t xml:space="preserve"> using versioning, offering better performance and scalability in low-conflict scenarios. On the other hand, </w:t>
+      </w:r>
+      <w:r>
+        <w:rPr>
+          <w:b/>
+          <w:bCs/>
+        </w:rPr>
+        <w:t>pessimistic locking</w:t>
+      </w:r>
+      <w:r>
+        <w:t xml:space="preserve"> focuses on </w:t>
+      </w:r>
+      <w:r>
+        <w:rPr>
+          <w:b/>
+          <w:bCs/>
+        </w:rPr>
+        <w:t>preventing conflicts upfront</w:t>
+      </w:r>
+      <w:r>
+        <w:t xml:space="preserve"> by blocking access to data until the transaction completes, ensuring stronger consistency but at the cost of concurrency and performance.</w:t>
+      </w:r>
+    </w:p>
+    <w:p>
+      <w:pPr>
+        <w:ind w:left="720" w:firstLine="360"/>
+        <w:jc w:val="both"/>
+      </w:pPr>
+      <w:r>
+        <w:t>Choosing between the two depends on the application’s requirements: optimistic locking is best when conflicts are rare and performance is a priority, while pessimistic locking is best when data consistency is critical and conflicts are expected frequently.</w:t>
+      </w:r>
+    </w:p>
+    <w:tbl>
+      <w:tblPr>
+        <w:tblW w:w="0" w:type="auto"/>
+        <w:tblCellSpacing w:w="15" w:type="dxa"/>
+        <w:tblBorders>
+          <w:top w:val="single" w:sz="4" w:space="0" w:color="auto"/>
+          <w:left w:val="single" w:sz="4" w:space="0" w:color="auto"/>
+          <w:bottom w:val="single" w:sz="4" w:space="0" w:color="auto"/>
+          <w:right w:val="single" w:sz="4" w:space="0" w:color="auto"/>
+          <w:insideH w:val="single" w:sz="4" w:space="0" w:color="auto"/>
+          <w:insideV w:val="single" w:sz="4" w:space="0" w:color="auto"/>
+        </w:tblBorders>
+        <w:tblCellMar>
+          <w:top w:w="15" w:type="dxa"/>
+          <w:left w:w="15" w:type="dxa"/>
+          <w:bottom w:w="15" w:type="dxa"/>
+          <w:right w:w="15" w:type="dxa"/>
+        </w:tblCellMar>
+        <w:tblLook w:val="04A0" w:firstRow="1" w:lastRow="0" w:firstColumn="1" w:lastColumn="0" w:noHBand="0" w:noVBand="1"/>
+      </w:tblPr>
+      <w:tblGrid>
+        <w:gridCol w:w="1706"/>
+        <w:gridCol w:w="4306"/>
+        <w:gridCol w:w="4444"/>
+      </w:tblGrid>
+      <w:tr>
+        <w:trPr>
+          <w:tblHeader/>
+          <w:tblCellSpacing w:w="15" w:type="dxa"/>
+        </w:trPr>
+        <w:tc>
+          <w:tcPr>
+            <w:tcW w:w="0" w:type="auto"/>
+            <w:vAlign w:val="center"/>
+            <w:hideMark/>
+          </w:tcPr>
+          <w:p>
+            <w:pPr>
+              <w:rPr>
+                <w:b/>
+                <w:bCs/>
+              </w:rPr>
+            </w:pPr>
+            <w:r>
+              <w:rPr>
+                <w:b/>
+                <w:bCs/>
+              </w:rPr>
+              <w:t>Aspect</w:t>
+            </w:r>
+          </w:p>
+        </w:tc>
+        <w:tc>
+          <w:tcPr>
+            <w:tcW w:w="0" w:type="auto"/>
+            <w:vAlign w:val="center"/>
+            <w:hideMark/>
+          </w:tcPr>
+          <w:p>
+            <w:pPr>
+              <w:rPr>
+                <w:b/>
+                <w:bCs/>
+              </w:rPr>
+            </w:pPr>
+            <w:r>
+              <w:rPr>
+                <w:b/>
+                <w:bCs/>
+              </w:rPr>
+              <w:t>Optimistic Locking</w:t>
+            </w:r>
+          </w:p>
+        </w:tc>
+        <w:tc>
+          <w:tcPr>
+            <w:tcW w:w="0" w:type="auto"/>
+            <w:vAlign w:val="center"/>
+            <w:hideMark/>
+          </w:tcPr>
+          <w:p>
+            <w:pPr>
+              <w:rPr>
+                <w:b/>
+                <w:bCs/>
+              </w:rPr>
+            </w:pPr>
+            <w:r>
+              <w:rPr>
+                <w:b/>
+                <w:bCs/>
+              </w:rPr>
+              <w:t>Pessimistic Locking</w:t>
+            </w:r>
+          </w:p>
+        </w:tc>
+      </w:tr>
+      <w:tr>
+        <w:trPr>
+          <w:tblCellSpacing w:w="15" w:type="dxa"/>
+        </w:trPr>
+        <w:tc>
+          <w:tcPr>
+            <w:tcW w:w="0" w:type="auto"/>
+            <w:vAlign w:val="center"/>
+            <w:hideMark/>
+          </w:tcPr>
+          <w:p>
+            <w:r>
+              <w:rPr>
+                <w:b/>
+                <w:bCs/>
+              </w:rPr>
+              <w:t>Approach</w:t>
+            </w:r>
+          </w:p>
+        </w:tc>
+        <w:tc>
+          <w:tcPr>
+            <w:tcW w:w="0" w:type="auto"/>
+            <w:vAlign w:val="center"/>
+            <w:hideMark/>
+          </w:tcPr>
+          <w:p>
+            <w:r>
+              <w:t xml:space="preserve">Assume conflicts are </w:t>
+            </w:r>
+            <w:r>
+              <w:rPr>
+                <w:b/>
+                <w:bCs/>
+              </w:rPr>
+              <w:t>rare</w:t>
+            </w:r>
+          </w:p>
+        </w:tc>
+        <w:tc>
+          <w:tcPr>
+            <w:tcW w:w="0" w:type="auto"/>
+            <w:vAlign w:val="center"/>
+            <w:hideMark/>
+          </w:tcPr>
+          <w:p>
+            <w:r>
+              <w:t xml:space="preserve">Assume conflicts are </w:t>
+            </w:r>
+            <w:r>
+              <w:rPr>
+                <w:b/>
+                <w:bCs/>
+              </w:rPr>
+              <w:t>common</w:t>
+            </w:r>
+          </w:p>
+        </w:tc>
+      </w:tr>
+      <w:tr>
+        <w:trPr>
+          <w:tblCellSpacing w:w="15" w:type="dxa"/>
+        </w:trPr>
+        <w:tc>
+          <w:tcPr>
+            <w:tcW w:w="0" w:type="auto"/>
+            <w:vAlign w:val="center"/>
+            <w:hideMark/>
+          </w:tcPr>
+          <w:p>
+            <w:r>
+              <w:rPr>
+                <w:b/>
+                <w:bCs/>
+              </w:rPr>
+              <w:t>Mechanism</w:t>
+            </w:r>
+          </w:p>
+        </w:tc>
+        <w:tc>
+          <w:tcPr>
+            <w:tcW w:w="0" w:type="auto"/>
+            <w:vAlign w:val="center"/>
+            <w:hideMark/>
+          </w:tcPr>
+          <w:p>
+            <w:r>
+              <w:t>Uses @Version field, checks version at commit</w:t>
+            </w:r>
+          </w:p>
+        </w:tc>
+        <w:tc>
+          <w:tcPr>
+            <w:tcW w:w="0" w:type="auto"/>
+            <w:vAlign w:val="center"/>
+            <w:hideMark/>
+          </w:tcPr>
+          <w:p>
+            <w:r>
+              <w:t xml:space="preserve">Uses </w:t>
+            </w:r>
+            <w:r>
+              <w:rPr>
+                <w:b/>
+                <w:bCs/>
+              </w:rPr>
+              <w:t>DB row locks</w:t>
+            </w:r>
+            <w:r>
+              <w:t xml:space="preserve"> (SELECT FOR UPDATE)</w:t>
+            </w:r>
+          </w:p>
+        </w:tc>
+      </w:tr>
+      <w:tr>
+        <w:trPr>
+          <w:tblCellSpacing w:w="15" w:type="dxa"/>
+        </w:trPr>
+        <w:tc>
+          <w:tcPr>
+            <w:tcW w:w="0" w:type="auto"/>
+            <w:vAlign w:val="center"/>
+            <w:hideMark/>
+          </w:tcPr>
+          <w:p>
+            <w:r>
+              <w:rPr>
+                <w:b/>
+                <w:bCs/>
+              </w:rPr>
+              <w:t>Concurrency</w:t>
+            </w:r>
+          </w:p>
+        </w:tc>
+        <w:tc>
+          <w:tcPr>
+            <w:tcW w:w="0" w:type="auto"/>
+            <w:vAlign w:val="center"/>
+            <w:hideMark/>
+          </w:tcPr>
+          <w:p>
+            <w:r>
+              <w:t>High concurrency (no blocking)</w:t>
+            </w:r>
+          </w:p>
+        </w:tc>
+        <w:tc>
+          <w:tcPr>
+            <w:tcW w:w="0" w:type="auto"/>
+            <w:vAlign w:val="center"/>
+            <w:hideMark/>
+          </w:tcPr>
+          <w:p>
+            <w:r>
+              <w:t>Low concurrency (blocking)</w:t>
+            </w:r>
+          </w:p>
+        </w:tc>
+      </w:tr>
+      <w:tr>
+        <w:trPr>
+          <w:tblCellSpacing w:w="15" w:type="dxa"/>
+        </w:trPr>
+        <w:tc>
+          <w:tcPr>
+            <w:tcW w:w="0" w:type="auto"/>
+            <w:vAlign w:val="center"/>
+            <w:hideMark/>
+          </w:tcPr>
+          <w:p>
+            <w:r>
+              <w:rPr>
+                <w:b/>
+                <w:bCs/>
+              </w:rPr>
+              <w:t>Performance</w:t>
+            </w:r>
+          </w:p>
+        </w:tc>
+        <w:tc>
+          <w:tcPr>
+            <w:tcW w:w="0" w:type="auto"/>
+            <w:vAlign w:val="center"/>
+            <w:hideMark/>
+          </w:tcPr>
+          <w:p>
+            <w:r>
+              <w:t>Better for systems with few conflicts</w:t>
+            </w:r>
+          </w:p>
+        </w:tc>
+        <w:tc>
+          <w:tcPr>
+            <w:tcW w:w="0" w:type="auto"/>
+            <w:vAlign w:val="center"/>
+            <w:hideMark/>
+          </w:tcPr>
+          <w:p>
+            <w:r>
+              <w:t>Slower due to locking overhead</w:t>
+            </w:r>
+          </w:p>
+        </w:tc>
+      </w:tr>
+      <w:tr>
+        <w:trPr>
+          <w:tblCellSpacing w:w="15" w:type="dxa"/>
+        </w:trPr>
+        <w:tc>
+          <w:tcPr>
+            <w:tcW w:w="0" w:type="auto"/>
+            <w:vAlign w:val="center"/>
+            <w:hideMark/>
+          </w:tcPr>
+          <w:p>
+            <w:r>
+              <w:rPr>
+                <w:b/>
+                <w:bCs/>
+              </w:rPr>
+              <w:t>Failure mode</w:t>
+            </w:r>
+          </w:p>
+        </w:tc>
+        <w:tc>
+          <w:tcPr>
+            <w:tcW w:w="0" w:type="auto"/>
+            <w:vAlign w:val="center"/>
+            <w:hideMark/>
+          </w:tcPr>
+          <w:p>
+            <w:r>
+              <w:t xml:space="preserve">Throws </w:t>
+            </w:r>
+            <w:proofErr w:type="spellStart"/>
+            <w:r>
+              <w:t>OptimisticLockException</w:t>
+            </w:r>
+            <w:proofErr w:type="spellEnd"/>
+            <w:r>
+              <w:t xml:space="preserve"> if conflict detected</w:t>
+            </w:r>
+          </w:p>
+        </w:tc>
+        <w:tc>
+          <w:tcPr>
+            <w:tcW w:w="0" w:type="auto"/>
+            <w:vAlign w:val="center"/>
+            <w:hideMark/>
+          </w:tcPr>
+          <w:p>
+            <w:r>
+              <w:t xml:space="preserve">Other transactions </w:t>
+            </w:r>
+            <w:r>
+              <w:rPr>
+                <w:b/>
+                <w:bCs/>
+              </w:rPr>
+              <w:t>wait</w:t>
+            </w:r>
+            <w:r>
+              <w:t xml:space="preserve"> (or deadlock risk)</w:t>
+            </w:r>
+          </w:p>
+        </w:tc>
+      </w:tr>
+      <w:tr>
+        <w:trPr>
+          <w:tblCellSpacing w:w="15" w:type="dxa"/>
+        </w:trPr>
+        <w:tc>
+          <w:tcPr>
+            <w:tcW w:w="0" w:type="auto"/>
+            <w:vAlign w:val="center"/>
+            <w:hideMark/>
+          </w:tcPr>
+          <w:p>
+            <w:r>
+              <w:rPr>
+                <w:b/>
+                <w:bCs/>
+              </w:rPr>
+              <w:t>Use case</w:t>
+            </w:r>
+          </w:p>
+        </w:tc>
+        <w:tc>
+          <w:tcPr>
+            <w:tcW w:w="0" w:type="auto"/>
+            <w:vAlign w:val="center"/>
+            <w:hideMark/>
+          </w:tcPr>
+          <w:p>
+            <w:r>
+              <w:t xml:space="preserve">Systems with high reads, low writes (e.g., profiles, </w:t>
+            </w:r>
+            <w:proofErr w:type="spellStart"/>
+            <w:r>
+              <w:t>catalogs</w:t>
+            </w:r>
+            <w:proofErr w:type="spellEnd"/>
+            <w:r>
+              <w:t>)</w:t>
+            </w:r>
+          </w:p>
+        </w:tc>
+        <w:tc>
+          <w:tcPr>
+            <w:tcW w:w="0" w:type="auto"/>
+            <w:vAlign w:val="center"/>
+            <w:hideMark/>
+          </w:tcPr>
+          <w:p>
+            <w:r>
+              <w:t>Systems with critical consistency (e.g., banking, booking)</w:t>
+            </w:r>
+          </w:p>
+        </w:tc>
+      </w:tr>
+      <w:tr>
+        <w:trPr>
+          <w:tblCellSpacing w:w="15" w:type="dxa"/>
+        </w:trPr>
+        <w:tc>
+          <w:tcPr>
+            <w:tcW w:w="0" w:type="auto"/>
+            <w:vAlign w:val="center"/>
+            <w:hideMark/>
+          </w:tcPr>
+          <w:p>
+            <w:r>
+              <w:rPr>
+                <w:b/>
+                <w:bCs/>
+              </w:rPr>
+              <w:t>Implementation</w:t>
+            </w:r>
+          </w:p>
+        </w:tc>
+        <w:tc>
+          <w:tcPr>
+            <w:tcW w:w="0" w:type="auto"/>
+            <w:vAlign w:val="center"/>
+            <w:hideMark/>
+          </w:tcPr>
+          <w:p>
+            <w:r>
+              <w:t>@Version field</w:t>
+            </w:r>
+          </w:p>
+        </w:tc>
+        <w:tc>
+          <w:tcPr>
+            <w:tcW w:w="0" w:type="auto"/>
+            <w:vAlign w:val="center"/>
+            <w:hideMark/>
+          </w:tcPr>
+          <w:p>
+            <w:proofErr w:type="spellStart"/>
+            <w:r>
+              <w:t>entityManager.find</w:t>
+            </w:r>
+            <w:proofErr w:type="spellEnd"/>
+            <w:r>
+              <w:t xml:space="preserve">(..., </w:t>
+            </w:r>
+            <w:proofErr w:type="spellStart"/>
+            <w:r>
+              <w:t>LockModeType.PESSIMISTIC</w:t>
+            </w:r>
+            <w:proofErr w:type="spellEnd"/>
+            <w:r>
+              <w:t>_*)</w:t>
+            </w:r>
+          </w:p>
+        </w:tc>
+      </w:tr>
+    </w:tbl>
+    <w:p/>
+    <w:p>
+      <w:pPr>
+        <w:pStyle w:val="Heading2"/>
+        <w:numPr>
+          <w:ilvl w:val="0"/>
+          <w:numId w:val="2"/>
+        </w:numPr>
+      </w:pPr>
+      <w:bookmarkStart w:id="5" w:name="_Toc208146884"/>
+      <w:r>
+        <w:t>What is the difference between native query and JPQL?</w:t>
+      </w:r>
+      <w:bookmarkEnd w:id="5"/>
+    </w:p>
+    <w:tbl>
+      <w:tblPr>
+        <w:tblW w:w="0" w:type="auto"/>
+        <w:tblCellSpacing w:w="15" w:type="dxa"/>
+        <w:tblBorders>
+          <w:top w:val="single" w:sz="4" w:space="0" w:color="auto"/>
+          <w:left w:val="single" w:sz="4" w:space="0" w:color="auto"/>
+          <w:bottom w:val="single" w:sz="4" w:space="0" w:color="auto"/>
+          <w:right w:val="single" w:sz="4" w:space="0" w:color="auto"/>
+          <w:insideH w:val="single" w:sz="4" w:space="0" w:color="auto"/>
+          <w:insideV w:val="single" w:sz="4" w:space="0" w:color="auto"/>
+        </w:tblBorders>
+        <w:tblCellMar>
+          <w:top w:w="15" w:type="dxa"/>
+          <w:left w:w="15" w:type="dxa"/>
+          <w:bottom w:w="15" w:type="dxa"/>
+          <w:right w:w="15" w:type="dxa"/>
+        </w:tblCellMar>
+        <w:tblLook w:val="04A0" w:firstRow="1" w:lastRow="0" w:firstColumn="1" w:lastColumn="0" w:noHBand="0" w:noVBand="1"/>
+      </w:tblPr>
+      <w:tblGrid>
+        <w:gridCol w:w="2272"/>
+        <w:gridCol w:w="3404"/>
+        <w:gridCol w:w="4780"/>
+      </w:tblGrid>
+      <w:tr>
+        <w:trPr>
+          <w:tblHeader/>
+          <w:tblCellSpacing w:w="15" w:type="dxa"/>
+        </w:trPr>
+        <w:tc>
+          <w:tcPr>
+            <w:tcW w:w="0" w:type="auto"/>
+            <w:vAlign w:val="center"/>
+            <w:hideMark/>
+          </w:tcPr>
+          <w:p>
+            <w:pPr>
+              <w:rPr>
+                <w:b/>
+                <w:bCs/>
+              </w:rPr>
+            </w:pPr>
+            <w:r>
+              <w:rPr>
+                <w:b/>
+                <w:bCs/>
+              </w:rPr>
+              <w:t>Aspect</w:t>
+            </w:r>
+          </w:p>
+        </w:tc>
+        <w:tc>
+          <w:tcPr>
+            <w:tcW w:w="0" w:type="auto"/>
+            <w:vAlign w:val="center"/>
+            <w:hideMark/>
+          </w:tcPr>
+          <w:p>
+            <w:pPr>
+              <w:rPr>
+                <w:b/>
+                <w:bCs/>
+              </w:rPr>
+            </w:pPr>
+            <w:r>
+              <w:rPr>
+                <w:b/>
+                <w:bCs/>
+              </w:rPr>
+              <w:t>JPQL</w:t>
+            </w:r>
+          </w:p>
+        </w:tc>
+        <w:tc>
+          <w:tcPr>
+            <w:tcW w:w="0" w:type="auto"/>
+            <w:vAlign w:val="center"/>
+            <w:hideMark/>
+          </w:tcPr>
+          <w:p>
+            <w:pPr>
+              <w:rPr>
+                <w:b/>
+                <w:bCs/>
+              </w:rPr>
+            </w:pPr>
+            <w:r>
+              <w:rPr>
+                <w:b/>
+                <w:bCs/>
+              </w:rPr>
+              <w:t>Native Query</w:t>
+            </w:r>
+          </w:p>
+        </w:tc>
+      </w:tr>
+      <w:tr>
+        <w:trPr>
+          <w:tblCellSpacing w:w="15" w:type="dxa"/>
+        </w:trPr>
+        <w:tc>
+          <w:tcPr>
+            <w:tcW w:w="0" w:type="auto"/>
+            <w:vAlign w:val="center"/>
+            <w:hideMark/>
+          </w:tcPr>
+          <w:p>
+            <w:r>
+              <w:rPr>
+                <w:b/>
+                <w:bCs/>
+              </w:rPr>
+              <w:t>Definition</w:t>
+            </w:r>
+          </w:p>
+        </w:tc>
+        <w:tc>
+          <w:tcPr>
+            <w:tcW w:w="0" w:type="auto"/>
+            <w:vAlign w:val="center"/>
+            <w:hideMark/>
+          </w:tcPr>
+          <w:p>
+            <w:r>
+              <w:t>JPA’s object-oriented query language</w:t>
+            </w:r>
+          </w:p>
+        </w:tc>
+        <w:tc>
+          <w:tcPr>
+            <w:tcW w:w="0" w:type="auto"/>
+            <w:vAlign w:val="center"/>
+            <w:hideMark/>
+          </w:tcPr>
+          <w:p>
+            <w:r>
+              <w:t>Raw SQL query</w:t>
+            </w:r>
+          </w:p>
+        </w:tc>
+      </w:tr>
+      <w:tr>
+        <w:trPr>
+          <w:tblCellSpacing w:w="15" w:type="dxa"/>
+        </w:trPr>
+        <w:tc>
+          <w:tcPr>
+            <w:tcW w:w="0" w:type="auto"/>
+            <w:vAlign w:val="center"/>
+            <w:hideMark/>
+          </w:tcPr>
+          <w:p>
+            <w:r>
+              <w:rPr>
+                <w:b/>
+                <w:bCs/>
+              </w:rPr>
+              <w:t>Operates on</w:t>
+            </w:r>
+          </w:p>
+        </w:tc>
+        <w:tc>
+          <w:tcPr>
+            <w:tcW w:w="0" w:type="auto"/>
+            <w:vAlign w:val="center"/>
+            <w:hideMark/>
+          </w:tcPr>
+          <w:p>
+            <w:r>
+              <w:t>Entities and their fields</w:t>
+            </w:r>
+          </w:p>
+        </w:tc>
+        <w:tc>
+          <w:tcPr>
+            <w:tcW w:w="0" w:type="auto"/>
+            <w:vAlign w:val="center"/>
+            <w:hideMark/>
+          </w:tcPr>
+          <w:p>
+            <w:r>
+              <w:t>Tables and columns</w:t>
+            </w:r>
+          </w:p>
+        </w:tc>
+      </w:tr>
+      <w:tr>
+        <w:trPr>
+          <w:tblCellSpacing w:w="15" w:type="dxa"/>
+        </w:trPr>
+        <w:tc>
+          <w:tcPr>
+            <w:tcW w:w="0" w:type="auto"/>
+            <w:vAlign w:val="center"/>
+            <w:hideMark/>
+          </w:tcPr>
+          <w:p>
+            <w:r>
+              <w:rPr>
+                <w:b/>
+                <w:bCs/>
+              </w:rPr>
+              <w:lastRenderedPageBreak/>
+              <w:t>Database dependency</w:t>
+            </w:r>
+          </w:p>
+        </w:tc>
+        <w:tc>
+          <w:tcPr>
+            <w:tcW w:w="0" w:type="auto"/>
+            <w:vAlign w:val="center"/>
+            <w:hideMark/>
+          </w:tcPr>
+          <w:p>
+            <w:r>
+              <w:t>Database-independent (portable)</w:t>
+            </w:r>
+          </w:p>
+        </w:tc>
+        <w:tc>
+          <w:tcPr>
+            <w:tcW w:w="0" w:type="auto"/>
+            <w:vAlign w:val="center"/>
+            <w:hideMark/>
+          </w:tcPr>
+          <w:p>
+            <w:r>
+              <w:t>Database-dependent (vendor-specific)</w:t>
+            </w:r>
+          </w:p>
+        </w:tc>
+      </w:tr>
+      <w:tr>
+        <w:trPr>
+          <w:tblCellSpacing w:w="15" w:type="dxa"/>
+        </w:trPr>
+        <w:tc>
+          <w:tcPr>
+            <w:tcW w:w="0" w:type="auto"/>
+            <w:vAlign w:val="center"/>
+            <w:hideMark/>
+          </w:tcPr>
+          <w:p>
+            <w:r>
+              <w:rPr>
+                <w:b/>
+                <w:bCs/>
+              </w:rPr>
+              <w:t>Flexibility</w:t>
+            </w:r>
+          </w:p>
+        </w:tc>
+        <w:tc>
+          <w:tcPr>
+            <w:tcW w:w="0" w:type="auto"/>
+            <w:vAlign w:val="center"/>
+            <w:hideMark/>
+          </w:tcPr>
+          <w:p>
+            <w:r>
+              <w:t>Limited to JPA features</w:t>
+            </w:r>
+          </w:p>
+        </w:tc>
+        <w:tc>
+          <w:tcPr>
+            <w:tcW w:w="0" w:type="auto"/>
+            <w:vAlign w:val="center"/>
+            <w:hideMark/>
+          </w:tcPr>
+          <w:p>
+            <w:r>
+              <w:t>Full SQL power (joins, functions, hints, stored procs)</w:t>
+            </w:r>
+          </w:p>
+        </w:tc>
+      </w:tr>
+      <w:tr>
+        <w:trPr>
+          <w:tblCellSpacing w:w="15" w:type="dxa"/>
+        </w:trPr>
+        <w:tc>
+          <w:tcPr>
+            <w:tcW w:w="0" w:type="auto"/>
+            <w:vAlign w:val="center"/>
+            <w:hideMark/>
+          </w:tcPr>
+          <w:p>
+            <w:r>
+              <w:rPr>
+                <w:b/>
+                <w:bCs/>
+              </w:rPr>
+              <w:t>Readability</w:t>
+            </w:r>
+          </w:p>
+        </w:tc>
+        <w:tc>
+          <w:tcPr>
+            <w:tcW w:w="0" w:type="auto"/>
+            <w:vAlign w:val="center"/>
+            <w:hideMark/>
+          </w:tcPr>
+          <w:p>
+            <w:r>
+              <w:t>Easier for object-oriented code</w:t>
+            </w:r>
+          </w:p>
+        </w:tc>
+        <w:tc>
+          <w:tcPr>
+            <w:tcW w:w="0" w:type="auto"/>
+            <w:vAlign w:val="center"/>
+            <w:hideMark/>
+          </w:tcPr>
+          <w:p>
+            <w:r>
+              <w:t>Familiar for SQL developers</w:t>
+            </w:r>
+          </w:p>
+        </w:tc>
+      </w:tr>
+      <w:tr>
+        <w:trPr>
+          <w:tblCellSpacing w:w="15" w:type="dxa"/>
+        </w:trPr>
+        <w:tc>
+          <w:tcPr>
+            <w:tcW w:w="0" w:type="auto"/>
+            <w:vAlign w:val="center"/>
+            <w:hideMark/>
+          </w:tcPr>
+          <w:p>
+            <w:r>
+              <w:rPr>
+                <w:b/>
+                <w:bCs/>
+              </w:rPr>
+              <w:t>Return type</w:t>
+            </w:r>
+          </w:p>
+        </w:tc>
+        <w:tc>
+          <w:tcPr>
+            <w:tcW w:w="0" w:type="auto"/>
+            <w:vAlign w:val="center"/>
+            <w:hideMark/>
+          </w:tcPr>
+          <w:p>
+            <w:r>
+              <w:t>Entity objects or DTOs</w:t>
+            </w:r>
+          </w:p>
+        </w:tc>
+        <w:tc>
+          <w:tcPr>
+            <w:tcW w:w="0" w:type="auto"/>
+            <w:vAlign w:val="center"/>
+            <w:hideMark/>
+          </w:tcPr>
+          <w:p>
+            <w:r>
+              <w:t>Entities, DTOs, or raw results</w:t>
+            </w:r>
+          </w:p>
+        </w:tc>
+      </w:tr>
+      <w:tr>
+        <w:trPr>
+          <w:tblCellSpacing w:w="15" w:type="dxa"/>
+        </w:trPr>
+        <w:tc>
+          <w:tcPr>
+            <w:tcW w:w="0" w:type="auto"/>
+            <w:vAlign w:val="center"/>
+            <w:hideMark/>
+          </w:tcPr>
+          <w:p>
+            <w:r>
+              <w:rPr>
+                <w:b/>
+                <w:bCs/>
+              </w:rPr>
+              <w:t>Use case</w:t>
+            </w:r>
+          </w:p>
+        </w:tc>
+        <w:tc>
+          <w:tcPr>
+            <w:tcW w:w="0" w:type="auto"/>
+            <w:vAlign w:val="center"/>
+            <w:hideMark/>
+          </w:tcPr>
+          <w:p>
+            <w:r>
+              <w:t>Standard queries across databases</w:t>
+            </w:r>
+          </w:p>
+        </w:tc>
+        <w:tc>
+          <w:tcPr>
+            <w:tcW w:w="0" w:type="auto"/>
+            <w:vAlign w:val="center"/>
+            <w:hideMark/>
+          </w:tcPr>
+          <w:p>
+            <w:r>
+              <w:t>Complex queries, vendor-specific features</w:t>
+            </w:r>
+          </w:p>
+        </w:tc>
+      </w:tr>
+    </w:tbl>
+    <w:p/>
     <w:sectPr>
       <w:pgSz w:w="11906" w:h="16838"/>
       <w:pgMar w:top="720" w:right="720" w:bottom="720" w:left="720" w:header="708" w:footer="708" w:gutter="0"/>
@@ -1552,7 +3830,7 @@
   <w:abstractNum w:abstractNumId="2" w15:restartNumberingAfterBreak="0">
     <w:nsid w:val="66855953"/>
     <w:multiLevelType w:val="hybridMultilevel"/>
-    <w:tmpl w:val="18EC80D2"/>
+    <w:tmpl w:val="9E2A5044"/>
     <w:lvl w:ilvl="0" w:tplc="40090001">
       <w:start w:val="1"/>
       <w:numFmt w:val="bullet"/>
@@ -2644,6 +4922,49 @@
       <w:shd w:val="clear" w:color="auto" w:fill="E1DFDD"/>
     </w:rPr>
   </w:style>
+  <w:style w:type="paragraph" w:styleId="NormalWeb">
+    <w:name w:val="Normal (Web)"/>
+    <w:basedOn w:val="Normal"/>
+    <w:uiPriority w:val="99"/>
+    <w:semiHidden/>
+    <w:unhideWhenUsed/>
+    <w:rsid w:val="001020B1"/>
+    <w:pPr>
+      <w:spacing w:before="100" w:beforeAutospacing="1" w:after="100" w:afterAutospacing="1" w:line="240" w:lineRule="auto"/>
+    </w:pPr>
+    <w:rPr>
+      <w:rFonts w:ascii="Times New Roman" w:eastAsia="Times New Roman" w:hAnsi="Times New Roman" w:cs="Times New Roman"/>
+      <w:kern w:val="0"/>
+      <w:sz w:val="24"/>
+      <w:szCs w:val="24"/>
+      <w:lang w:eastAsia="en-IN"/>
+      <w14:ligatures w14:val="none"/>
+    </w:rPr>
+  </w:style>
+  <w:style w:type="character" w:styleId="Strong">
+    <w:name w:val="Strong"/>
+    <w:basedOn w:val="DefaultParagraphFont"/>
+    <w:uiPriority w:val="22"/>
+    <w:qFormat/>
+    <w:rsid w:val="001020B1"/>
+    <w:rPr>
+      <w:b/>
+      <w:bCs/>
+    </w:rPr>
+  </w:style>
+  <w:style w:type="character" w:styleId="HTMLCode">
+    <w:name w:val="HTML Code"/>
+    <w:basedOn w:val="DefaultParagraphFont"/>
+    <w:uiPriority w:val="99"/>
+    <w:semiHidden/>
+    <w:unhideWhenUsed/>
+    <w:rsid w:val="001020B1"/>
+    <w:rPr>
+      <w:rFonts w:ascii="Courier New" w:eastAsia="Times New Roman" w:hAnsi="Courier New" w:cs="Courier New"/>
+      <w:sz w:val="20"/>
+      <w:szCs w:val="20"/>
+    </w:rPr>
+  </w:style>
 </w:styles>
 </file>
 

</xml_diff>